<commit_message>
13. Kosar visszajelzes, szepites
</commit_message>
<xml_diff>
--- a/PandaPlug dokumentacio.docx
+++ b/PandaPlug dokumentacio.docx
@@ -30,8 +30,364 @@
     </w:p>
     <w:p>
       <w:pPr>
-        <w:spacing w:before="100" w:beforeAutospacing="1" w:after="240" w:line="276" w:lineRule="auto"/>
-        <w:jc w:val="center"/>
+        <w:spacing w:before="100" w:beforeAutospacing="1" w:after="100" w:afterAutospacing="1" w:line="240" w:lineRule="auto"/>
+        <w:rPr>
+          <w:rFonts w:ascii="Times New Roman" w:eastAsia="Times New Roman" w:hAnsi="Times New Roman" w:cs="Times New Roman"/>
+          <w:sz w:val="24"/>
+          <w:szCs w:val="24"/>
+          <w:lang w:eastAsia="hu-HU"/>
+        </w:rPr>
+      </w:pPr>
+      <w:r>
+        <w:rPr>
+          <w:rFonts w:ascii="Times New Roman" w:eastAsia="Times New Roman" w:hAnsi="Times New Roman" w:cs="Times New Roman"/>
+          <w:sz w:val="24"/>
+          <w:szCs w:val="24"/>
+          <w:lang w:eastAsia="hu-HU"/>
+        </w:rPr>
+        <w:t xml:space="preserve">A </w:t>
+      </w:r>
+      <w:proofErr w:type="spellStart"/>
+      <w:r>
+        <w:rPr>
+          <w:rFonts w:ascii="Times New Roman" w:eastAsia="Times New Roman" w:hAnsi="Times New Roman" w:cs="Times New Roman"/>
+          <w:sz w:val="24"/>
+          <w:szCs w:val="24"/>
+          <w:lang w:eastAsia="hu-HU"/>
+        </w:rPr>
+        <w:t>PandaPlug</w:t>
+      </w:r>
+      <w:proofErr w:type="spellEnd"/>
+      <w:r>
+        <w:rPr>
+          <w:rFonts w:ascii="Times New Roman" w:eastAsia="Times New Roman" w:hAnsi="Times New Roman" w:cs="Times New Roman"/>
+          <w:sz w:val="24"/>
+          <w:szCs w:val="24"/>
+          <w:lang w:eastAsia="hu-HU"/>
+        </w:rPr>
+        <w:t xml:space="preserve"> egy modern online webshop, amely nemzetközi </w:t>
+      </w:r>
+      <w:proofErr w:type="spellStart"/>
+      <w:r>
+        <w:rPr>
+          <w:rFonts w:ascii="Times New Roman" w:eastAsia="Times New Roman" w:hAnsi="Times New Roman" w:cs="Times New Roman"/>
+          <w:sz w:val="24"/>
+          <w:szCs w:val="24"/>
+          <w:lang w:eastAsia="hu-HU"/>
+        </w:rPr>
+        <w:t>designer</w:t>
+      </w:r>
+      <w:proofErr w:type="spellEnd"/>
+      <w:r>
+        <w:rPr>
+          <w:rFonts w:ascii="Times New Roman" w:eastAsia="Times New Roman" w:hAnsi="Times New Roman" w:cs="Times New Roman"/>
+          <w:sz w:val="24"/>
+          <w:szCs w:val="24"/>
+          <w:lang w:eastAsia="hu-HU"/>
+        </w:rPr>
+        <w:t xml:space="preserve"> és </w:t>
+      </w:r>
+      <w:proofErr w:type="spellStart"/>
+      <w:r>
+        <w:rPr>
+          <w:rFonts w:ascii="Times New Roman" w:eastAsia="Times New Roman" w:hAnsi="Times New Roman" w:cs="Times New Roman"/>
+          <w:sz w:val="24"/>
+          <w:szCs w:val="24"/>
+          <w:lang w:eastAsia="hu-HU"/>
+        </w:rPr>
+        <w:t>streetwear</w:t>
+      </w:r>
+      <w:proofErr w:type="spellEnd"/>
+      <w:r>
+        <w:rPr>
+          <w:rFonts w:ascii="Times New Roman" w:eastAsia="Times New Roman" w:hAnsi="Times New Roman" w:cs="Times New Roman"/>
+          <w:sz w:val="24"/>
+          <w:szCs w:val="24"/>
+          <w:lang w:eastAsia="hu-HU"/>
+        </w:rPr>
+        <w:t xml:space="preserve"> márkák legújabb kollekcióit kínálja egy helyen. A kínálatban pólók, pulóverek, nadrágok és rövidnadrágok találhatók, különös hangsúlyt fektetve a minőségre és a hitelességre. Az oldalon olyan ismert márkák termékei érhetők el, mint a Chrome </w:t>
+      </w:r>
+      <w:proofErr w:type="spellStart"/>
+      <w:r>
+        <w:rPr>
+          <w:rFonts w:ascii="Times New Roman" w:eastAsia="Times New Roman" w:hAnsi="Times New Roman" w:cs="Times New Roman"/>
+          <w:sz w:val="24"/>
+          <w:szCs w:val="24"/>
+          <w:lang w:eastAsia="hu-HU"/>
+        </w:rPr>
+        <w:t>Hearts</w:t>
+      </w:r>
+      <w:proofErr w:type="spellEnd"/>
+      <w:r>
+        <w:rPr>
+          <w:rFonts w:ascii="Times New Roman" w:eastAsia="Times New Roman" w:hAnsi="Times New Roman" w:cs="Times New Roman"/>
+          <w:sz w:val="24"/>
+          <w:szCs w:val="24"/>
+          <w:lang w:eastAsia="hu-HU"/>
+        </w:rPr>
+        <w:t xml:space="preserve">, a </w:t>
+      </w:r>
+      <w:proofErr w:type="spellStart"/>
+      <w:r>
+        <w:rPr>
+          <w:rFonts w:ascii="Times New Roman" w:eastAsia="Times New Roman" w:hAnsi="Times New Roman" w:cs="Times New Roman"/>
+          <w:sz w:val="24"/>
+          <w:szCs w:val="24"/>
+          <w:lang w:eastAsia="hu-HU"/>
+        </w:rPr>
+        <w:t>Stüssy</w:t>
+      </w:r>
+      <w:proofErr w:type="spellEnd"/>
+      <w:r>
+        <w:rPr>
+          <w:rFonts w:ascii="Times New Roman" w:eastAsia="Times New Roman" w:hAnsi="Times New Roman" w:cs="Times New Roman"/>
+          <w:sz w:val="24"/>
+          <w:szCs w:val="24"/>
+          <w:lang w:eastAsia="hu-HU"/>
+        </w:rPr>
+        <w:t xml:space="preserve"> és a </w:t>
+      </w:r>
+      <w:proofErr w:type="spellStart"/>
+      <w:r>
+        <w:rPr>
+          <w:rFonts w:ascii="Times New Roman" w:eastAsia="Times New Roman" w:hAnsi="Times New Roman" w:cs="Times New Roman"/>
+          <w:sz w:val="24"/>
+          <w:szCs w:val="24"/>
+          <w:lang w:eastAsia="hu-HU"/>
+        </w:rPr>
+        <w:t>Denim</w:t>
+      </w:r>
+      <w:proofErr w:type="spellEnd"/>
+      <w:r>
+        <w:rPr>
+          <w:rFonts w:ascii="Times New Roman" w:eastAsia="Times New Roman" w:hAnsi="Times New Roman" w:cs="Times New Roman"/>
+          <w:sz w:val="24"/>
+          <w:szCs w:val="24"/>
+          <w:lang w:eastAsia="hu-HU"/>
+        </w:rPr>
+        <w:t xml:space="preserve"> </w:t>
+      </w:r>
+      <w:proofErr w:type="spellStart"/>
+      <w:r>
+        <w:rPr>
+          <w:rFonts w:ascii="Times New Roman" w:eastAsia="Times New Roman" w:hAnsi="Times New Roman" w:cs="Times New Roman"/>
+          <w:sz w:val="24"/>
+          <w:szCs w:val="24"/>
+          <w:lang w:eastAsia="hu-HU"/>
+        </w:rPr>
+        <w:t>Tears</w:t>
+      </w:r>
+      <w:proofErr w:type="spellEnd"/>
+      <w:r>
+        <w:rPr>
+          <w:rFonts w:ascii="Times New Roman" w:eastAsia="Times New Roman" w:hAnsi="Times New Roman" w:cs="Times New Roman"/>
+          <w:sz w:val="24"/>
+          <w:szCs w:val="24"/>
+          <w:lang w:eastAsia="hu-HU"/>
+        </w:rPr>
+        <w:t>.</w:t>
+      </w:r>
+    </w:p>
+    <w:p>
+      <w:pPr>
+        <w:spacing w:before="100" w:beforeAutospacing="1" w:after="100" w:afterAutospacing="1" w:line="240" w:lineRule="auto"/>
+        <w:rPr>
+          <w:rFonts w:ascii="Times New Roman" w:eastAsia="Times New Roman" w:hAnsi="Times New Roman" w:cs="Times New Roman"/>
+          <w:sz w:val="24"/>
+          <w:szCs w:val="24"/>
+          <w:lang w:eastAsia="hu-HU"/>
+        </w:rPr>
+      </w:pPr>
+      <w:r>
+        <w:rPr>
+          <w:rFonts w:ascii="Times New Roman" w:eastAsia="Times New Roman" w:hAnsi="Times New Roman" w:cs="Times New Roman"/>
+          <w:sz w:val="24"/>
+          <w:szCs w:val="24"/>
+          <w:lang w:eastAsia="hu-HU"/>
+        </w:rPr>
+        <w:t>A weboldal letisztult, átlátható dizájnnal és egyszerű navigációval rendelkezik, amely lehetővé teszi a gyors keresést, szűrést és rendezést. Reszponzív kialakításának köszönhetően asztali gépen, tableten és mobiltele</w:t>
+      </w:r>
+      <w:bookmarkStart w:id="0" w:name="_GoBack"/>
+      <w:bookmarkEnd w:id="0"/>
+      <w:r>
+        <w:rPr>
+          <w:rFonts w:ascii="Times New Roman" w:eastAsia="Times New Roman" w:hAnsi="Times New Roman" w:cs="Times New Roman"/>
+          <w:sz w:val="24"/>
+          <w:szCs w:val="24"/>
+          <w:lang w:eastAsia="hu-HU"/>
+        </w:rPr>
+        <w:t>fonon is optimálisan működik.</w:t>
+      </w:r>
+    </w:p>
+    <w:p>
+      <w:pPr>
+        <w:spacing w:before="100" w:beforeAutospacing="1" w:after="100" w:afterAutospacing="1" w:line="240" w:lineRule="auto"/>
+        <w:rPr>
+          <w:rFonts w:ascii="Times New Roman" w:eastAsia="Times New Roman" w:hAnsi="Times New Roman" w:cs="Times New Roman"/>
+          <w:sz w:val="24"/>
+          <w:szCs w:val="24"/>
+          <w:lang w:eastAsia="hu-HU"/>
+        </w:rPr>
+      </w:pPr>
+      <w:r>
+        <w:rPr>
+          <w:rFonts w:ascii="Times New Roman" w:eastAsia="Times New Roman" w:hAnsi="Times New Roman" w:cs="Times New Roman"/>
+          <w:sz w:val="24"/>
+          <w:szCs w:val="24"/>
+          <w:lang w:eastAsia="hu-HU"/>
+        </w:rPr>
+        <w:t xml:space="preserve">A </w:t>
+      </w:r>
+      <w:proofErr w:type="spellStart"/>
+      <w:r>
+        <w:rPr>
+          <w:rFonts w:ascii="Times New Roman" w:eastAsia="Times New Roman" w:hAnsi="Times New Roman" w:cs="Times New Roman"/>
+          <w:sz w:val="24"/>
+          <w:szCs w:val="24"/>
+          <w:lang w:eastAsia="hu-HU"/>
+        </w:rPr>
+        <w:t>PandaPlug</w:t>
+      </w:r>
+      <w:proofErr w:type="spellEnd"/>
+      <w:r>
+        <w:rPr>
+          <w:rFonts w:ascii="Times New Roman" w:eastAsia="Times New Roman" w:hAnsi="Times New Roman" w:cs="Times New Roman"/>
+          <w:sz w:val="24"/>
+          <w:szCs w:val="24"/>
+          <w:lang w:eastAsia="hu-HU"/>
+        </w:rPr>
+        <w:t xml:space="preserve"> célja, hogy hidat képezzen a vásárlók és a prémium </w:t>
+      </w:r>
+      <w:proofErr w:type="spellStart"/>
+      <w:r>
+        <w:rPr>
+          <w:rFonts w:ascii="Times New Roman" w:eastAsia="Times New Roman" w:hAnsi="Times New Roman" w:cs="Times New Roman"/>
+          <w:sz w:val="24"/>
+          <w:szCs w:val="24"/>
+          <w:lang w:eastAsia="hu-HU"/>
+        </w:rPr>
+        <w:t>streetwear</w:t>
+      </w:r>
+      <w:proofErr w:type="spellEnd"/>
+      <w:r>
+        <w:rPr>
+          <w:rFonts w:ascii="Times New Roman" w:eastAsia="Times New Roman" w:hAnsi="Times New Roman" w:cs="Times New Roman"/>
+          <w:sz w:val="24"/>
+          <w:szCs w:val="24"/>
+          <w:lang w:eastAsia="hu-HU"/>
+        </w:rPr>
+        <w:t xml:space="preserve"> márkák között, miközben biztonságos és megbízható vásárlási élményt nyújt. A rendszer modern fizetési és adatvédelmi megoldásokat alkalmaz, a rendelési folyamat pedig egyszerű és átlátható.</w:t>
+      </w:r>
+    </w:p>
+    <w:p>
+      <w:pPr>
+        <w:spacing w:before="100" w:beforeAutospacing="1" w:after="100" w:afterAutospacing="1" w:line="240" w:lineRule="auto"/>
+        <w:rPr>
+          <w:rFonts w:ascii="Times New Roman" w:eastAsia="Times New Roman" w:hAnsi="Times New Roman" w:cs="Times New Roman"/>
+          <w:sz w:val="24"/>
+          <w:szCs w:val="24"/>
+          <w:lang w:eastAsia="hu-HU"/>
+        </w:rPr>
+      </w:pPr>
+      <w:r>
+        <w:rPr>
+          <w:rFonts w:ascii="Times New Roman" w:eastAsia="Times New Roman" w:hAnsi="Times New Roman" w:cs="Times New Roman"/>
+          <w:sz w:val="24"/>
+          <w:szCs w:val="24"/>
+          <w:lang w:eastAsia="hu-HU"/>
+        </w:rPr>
+        <w:t xml:space="preserve">Az oldal indításához először az </w:t>
+      </w:r>
+      <w:proofErr w:type="spellStart"/>
+      <w:r>
+        <w:rPr>
+          <w:rFonts w:ascii="Courier New" w:eastAsia="Times New Roman" w:hAnsi="Courier New" w:cs="Courier New"/>
+          <w:sz w:val="20"/>
+          <w:szCs w:val="20"/>
+          <w:lang w:eastAsia="hu-HU"/>
+        </w:rPr>
+        <w:t>npm</w:t>
+      </w:r>
+      <w:proofErr w:type="spellEnd"/>
+      <w:r>
+        <w:rPr>
+          <w:rFonts w:ascii="Courier New" w:eastAsia="Times New Roman" w:hAnsi="Courier New" w:cs="Courier New"/>
+          <w:sz w:val="20"/>
+          <w:szCs w:val="20"/>
+          <w:lang w:eastAsia="hu-HU"/>
+        </w:rPr>
+        <w:t xml:space="preserve"> </w:t>
+      </w:r>
+      <w:proofErr w:type="spellStart"/>
+      <w:r>
+        <w:rPr>
+          <w:rFonts w:ascii="Courier New" w:eastAsia="Times New Roman" w:hAnsi="Courier New" w:cs="Courier New"/>
+          <w:sz w:val="20"/>
+          <w:szCs w:val="20"/>
+          <w:lang w:eastAsia="hu-HU"/>
+        </w:rPr>
+        <w:t>install</w:t>
+      </w:r>
+      <w:proofErr w:type="spellEnd"/>
+      <w:r>
+        <w:rPr>
+          <w:rFonts w:ascii="Times New Roman" w:eastAsia="Times New Roman" w:hAnsi="Times New Roman" w:cs="Times New Roman"/>
+          <w:sz w:val="24"/>
+          <w:szCs w:val="24"/>
+          <w:lang w:eastAsia="hu-HU"/>
+        </w:rPr>
+        <w:t xml:space="preserve"> parancs futtatása szükséges a szükséges bővítmények telepítéséhez, majd az alkalmazás az </w:t>
+      </w:r>
+      <w:proofErr w:type="spellStart"/>
+      <w:r>
+        <w:rPr>
+          <w:rFonts w:ascii="Courier New" w:eastAsia="Times New Roman" w:hAnsi="Courier New" w:cs="Courier New"/>
+          <w:sz w:val="20"/>
+          <w:szCs w:val="20"/>
+          <w:lang w:eastAsia="hu-HU"/>
+        </w:rPr>
+        <w:t>npm</w:t>
+      </w:r>
+      <w:proofErr w:type="spellEnd"/>
+      <w:r>
+        <w:rPr>
+          <w:rFonts w:ascii="Courier New" w:eastAsia="Times New Roman" w:hAnsi="Courier New" w:cs="Courier New"/>
+          <w:sz w:val="20"/>
+          <w:szCs w:val="20"/>
+          <w:lang w:eastAsia="hu-HU"/>
+        </w:rPr>
+        <w:t xml:space="preserve"> start</w:t>
+      </w:r>
+      <w:r>
+        <w:rPr>
+          <w:rFonts w:ascii="Times New Roman" w:eastAsia="Times New Roman" w:hAnsi="Times New Roman" w:cs="Times New Roman"/>
+          <w:sz w:val="24"/>
+          <w:szCs w:val="24"/>
+          <w:lang w:eastAsia="hu-HU"/>
+        </w:rPr>
+        <w:t xml:space="preserve"> paranccsal indítható el</w:t>
+      </w:r>
+      <w:r>
+        <w:rPr>
+          <w:rFonts w:ascii="Times New Roman" w:eastAsia="Times New Roman" w:hAnsi="Times New Roman" w:cs="Times New Roman"/>
+          <w:sz w:val="24"/>
+          <w:szCs w:val="24"/>
+          <w:lang w:eastAsia="hu-HU"/>
+        </w:rPr>
+        <w:t xml:space="preserve"> mind frontend és backend felületen</w:t>
+      </w:r>
+      <w:r>
+        <w:rPr>
+          <w:rFonts w:ascii="Times New Roman" w:eastAsia="Times New Roman" w:hAnsi="Times New Roman" w:cs="Times New Roman"/>
+          <w:sz w:val="24"/>
+          <w:szCs w:val="24"/>
+          <w:lang w:eastAsia="hu-HU"/>
+        </w:rPr>
+        <w:t>.</w:t>
+      </w:r>
+    </w:p>
+    <w:p>
+      <w:pPr>
         <w:rPr>
           <w:rFonts w:ascii="Times New Roman" w:eastAsia="Times New Roman" w:hAnsi="Times New Roman" w:cs="Times New Roman"/>
           <w:sz w:val="26"/>
@@ -41,878 +397,10 @@
       </w:pPr>
       <w:r>
         <w:rPr>
-          <w:rFonts w:ascii="Times New Roman" w:eastAsia="Times New Roman" w:hAnsi="Times New Roman" w:cs="Times New Roman"/>
-          <w:sz w:val="26"/>
-          <w:szCs w:val="26"/>
-          <w:lang w:eastAsia="hu-HU"/>
-        </w:rPr>
-        <w:t xml:space="preserve">A </w:t>
-      </w:r>
-      <w:proofErr w:type="spellStart"/>
-      <w:r>
-        <w:rPr>
-          <w:rFonts w:ascii="Times New Roman" w:eastAsia="Times New Roman" w:hAnsi="Times New Roman" w:cs="Times New Roman"/>
           <w:b/>
           <w:bCs/>
           <w:sz w:val="26"/>
           <w:szCs w:val="26"/>
-          <w:lang w:eastAsia="hu-HU"/>
-        </w:rPr>
-        <w:t>PandaPlug</w:t>
-      </w:r>
-      <w:proofErr w:type="spellEnd"/>
-      <w:r>
-        <w:rPr>
-          <w:rFonts w:ascii="Times New Roman" w:eastAsia="Times New Roman" w:hAnsi="Times New Roman" w:cs="Times New Roman"/>
-          <w:sz w:val="26"/>
-          <w:szCs w:val="26"/>
-          <w:lang w:eastAsia="hu-HU"/>
-        </w:rPr>
-        <w:t xml:space="preserve"> egy modern, online értékesítési platform, amely a nemzetközi </w:t>
-      </w:r>
-      <w:proofErr w:type="spellStart"/>
-      <w:r>
-        <w:rPr>
-          <w:rFonts w:ascii="Times New Roman" w:eastAsia="Times New Roman" w:hAnsi="Times New Roman" w:cs="Times New Roman"/>
-          <w:sz w:val="26"/>
-          <w:szCs w:val="26"/>
-          <w:lang w:eastAsia="hu-HU"/>
-        </w:rPr>
-        <w:t>designer</w:t>
-      </w:r>
-      <w:proofErr w:type="spellEnd"/>
-      <w:r>
-        <w:rPr>
-          <w:rFonts w:ascii="Times New Roman" w:eastAsia="Times New Roman" w:hAnsi="Times New Roman" w:cs="Times New Roman"/>
-          <w:sz w:val="26"/>
-          <w:szCs w:val="26"/>
-          <w:lang w:eastAsia="hu-HU"/>
-        </w:rPr>
-        <w:t xml:space="preserve"> és </w:t>
-      </w:r>
-      <w:proofErr w:type="spellStart"/>
-      <w:r>
-        <w:rPr>
-          <w:rFonts w:ascii="Times New Roman" w:eastAsia="Times New Roman" w:hAnsi="Times New Roman" w:cs="Times New Roman"/>
-          <w:sz w:val="26"/>
-          <w:szCs w:val="26"/>
-          <w:lang w:eastAsia="hu-HU"/>
-        </w:rPr>
-        <w:t>streetwear</w:t>
-      </w:r>
-      <w:proofErr w:type="spellEnd"/>
-      <w:r>
-        <w:rPr>
-          <w:rFonts w:ascii="Times New Roman" w:eastAsia="Times New Roman" w:hAnsi="Times New Roman" w:cs="Times New Roman"/>
-          <w:sz w:val="26"/>
-          <w:szCs w:val="26"/>
-          <w:lang w:eastAsia="hu-HU"/>
-        </w:rPr>
-        <w:t xml:space="preserve"> márkák legújabb ruházati kollekcióit kínálja. Az oldal célja, hogy egy helyen, könnyen elérhető formában biztosítsa a vásárlók számára a </w:t>
-      </w:r>
-      <w:r>
-        <w:rPr>
-          <w:rFonts w:ascii="Times New Roman" w:eastAsia="Times New Roman" w:hAnsi="Times New Roman" w:cs="Times New Roman"/>
-          <w:sz w:val="26"/>
-          <w:szCs w:val="26"/>
-          <w:u w:val="single"/>
-          <w:lang w:eastAsia="hu-HU"/>
-        </w:rPr>
-        <w:t>világszerte ismert márkák termékeit, miközben egyszerű és biztonságos vásárlási élményt nyújt</w:t>
-      </w:r>
-      <w:r>
-        <w:rPr>
-          <w:rFonts w:ascii="Times New Roman" w:eastAsia="Times New Roman" w:hAnsi="Times New Roman" w:cs="Times New Roman"/>
-          <w:sz w:val="26"/>
-          <w:szCs w:val="26"/>
-          <w:lang w:eastAsia="hu-HU"/>
-        </w:rPr>
-        <w:t>.</w:t>
-      </w:r>
-    </w:p>
-    <w:p>
-      <w:pPr>
-        <w:spacing w:before="100" w:beforeAutospacing="1" w:after="100" w:afterAutospacing="1" w:line="276" w:lineRule="auto"/>
-        <w:jc w:val="center"/>
-        <w:rPr>
-          <w:rFonts w:ascii="Times New Roman" w:eastAsia="Times New Roman" w:hAnsi="Times New Roman" w:cs="Times New Roman"/>
-          <w:sz w:val="26"/>
-          <w:szCs w:val="26"/>
-          <w:lang w:eastAsia="hu-HU"/>
-        </w:rPr>
-      </w:pPr>
-      <w:r>
-        <w:rPr>
-          <w:rFonts w:ascii="Times New Roman" w:eastAsia="Times New Roman" w:hAnsi="Times New Roman" w:cs="Times New Roman"/>
-          <w:sz w:val="26"/>
-          <w:szCs w:val="26"/>
-          <w:lang w:eastAsia="hu-HU"/>
-        </w:rPr>
-        <w:t xml:space="preserve">A </w:t>
-      </w:r>
-      <w:proofErr w:type="spellStart"/>
-      <w:r>
-        <w:rPr>
-          <w:rFonts w:ascii="Times New Roman" w:eastAsia="Times New Roman" w:hAnsi="Times New Roman" w:cs="Times New Roman"/>
-          <w:b/>
-          <w:sz w:val="26"/>
-          <w:szCs w:val="26"/>
-          <w:lang w:eastAsia="hu-HU"/>
-        </w:rPr>
-        <w:t>PandaPlug</w:t>
-      </w:r>
-      <w:proofErr w:type="spellEnd"/>
-      <w:r>
-        <w:rPr>
-          <w:rFonts w:ascii="Times New Roman" w:eastAsia="Times New Roman" w:hAnsi="Times New Roman" w:cs="Times New Roman"/>
-          <w:sz w:val="26"/>
-          <w:szCs w:val="26"/>
-          <w:lang w:eastAsia="hu-HU"/>
-        </w:rPr>
-        <w:t xml:space="preserve"> különböző stílusú és kategóriájú ruhadarabokat forgalmaz, beleértve a </w:t>
-      </w:r>
-      <w:r>
-        <w:rPr>
-          <w:rFonts w:ascii="Times New Roman" w:eastAsia="Times New Roman" w:hAnsi="Times New Roman" w:cs="Times New Roman"/>
-          <w:bCs/>
-          <w:sz w:val="26"/>
-          <w:szCs w:val="26"/>
-          <w:lang w:eastAsia="hu-HU"/>
-        </w:rPr>
-        <w:t>pólókat, pulóvereket, nadrágokat és rövidnadrágokat</w:t>
-      </w:r>
-      <w:r>
-        <w:rPr>
-          <w:rFonts w:ascii="Times New Roman" w:eastAsia="Times New Roman" w:hAnsi="Times New Roman" w:cs="Times New Roman"/>
-          <w:sz w:val="26"/>
-          <w:szCs w:val="26"/>
-          <w:lang w:eastAsia="hu-HU"/>
-        </w:rPr>
-        <w:t xml:space="preserve">. </w:t>
-      </w:r>
-      <w:r>
-        <w:rPr>
-          <w:rFonts w:ascii="Times New Roman" w:eastAsia="Times New Roman" w:hAnsi="Times New Roman" w:cs="Times New Roman"/>
-          <w:sz w:val="26"/>
-          <w:szCs w:val="26"/>
-          <w:u w:val="single"/>
-          <w:lang w:eastAsia="hu-HU"/>
-        </w:rPr>
-        <w:t xml:space="preserve">A termékpaletta összeállítása során a hangsúly a </w:t>
-      </w:r>
-      <w:r>
-        <w:rPr>
-          <w:rFonts w:ascii="Times New Roman" w:eastAsia="Times New Roman" w:hAnsi="Times New Roman" w:cs="Times New Roman"/>
-          <w:bCs/>
-          <w:sz w:val="26"/>
-          <w:szCs w:val="26"/>
-          <w:u w:val="single"/>
-          <w:lang w:eastAsia="hu-HU"/>
-        </w:rPr>
-        <w:t>minőségen</w:t>
-      </w:r>
-      <w:r>
-        <w:rPr>
-          <w:rFonts w:ascii="Times New Roman" w:eastAsia="Times New Roman" w:hAnsi="Times New Roman" w:cs="Times New Roman"/>
-          <w:sz w:val="26"/>
-          <w:szCs w:val="26"/>
-          <w:u w:val="single"/>
-          <w:lang w:eastAsia="hu-HU"/>
-        </w:rPr>
-        <w:t xml:space="preserve">, a </w:t>
-      </w:r>
-      <w:r>
-        <w:rPr>
-          <w:rFonts w:ascii="Times New Roman" w:eastAsia="Times New Roman" w:hAnsi="Times New Roman" w:cs="Times New Roman"/>
-          <w:bCs/>
-          <w:sz w:val="26"/>
-          <w:szCs w:val="26"/>
-          <w:u w:val="single"/>
-          <w:lang w:eastAsia="hu-HU"/>
-        </w:rPr>
-        <w:t>stíluson</w:t>
-      </w:r>
-      <w:r>
-        <w:rPr>
-          <w:rFonts w:ascii="Times New Roman" w:eastAsia="Times New Roman" w:hAnsi="Times New Roman" w:cs="Times New Roman"/>
-          <w:sz w:val="26"/>
-          <w:szCs w:val="26"/>
-          <w:u w:val="single"/>
-          <w:lang w:eastAsia="hu-HU"/>
-        </w:rPr>
-        <w:t xml:space="preserve"> és a </w:t>
-      </w:r>
-      <w:r>
-        <w:rPr>
-          <w:rFonts w:ascii="Times New Roman" w:eastAsia="Times New Roman" w:hAnsi="Times New Roman" w:cs="Times New Roman"/>
-          <w:bCs/>
-          <w:sz w:val="26"/>
-          <w:szCs w:val="26"/>
-          <w:u w:val="single"/>
-          <w:lang w:eastAsia="hu-HU"/>
-        </w:rPr>
-        <w:t>hitelességen</w:t>
-      </w:r>
-      <w:r>
-        <w:rPr>
-          <w:rFonts w:ascii="Times New Roman" w:eastAsia="Times New Roman" w:hAnsi="Times New Roman" w:cs="Times New Roman"/>
-          <w:sz w:val="26"/>
-          <w:szCs w:val="26"/>
-          <w:u w:val="single"/>
-          <w:lang w:eastAsia="hu-HU"/>
-        </w:rPr>
-        <w:t xml:space="preserve"> van</w:t>
-      </w:r>
-      <w:r>
-        <w:rPr>
-          <w:rFonts w:ascii="Times New Roman" w:eastAsia="Times New Roman" w:hAnsi="Times New Roman" w:cs="Times New Roman"/>
-          <w:sz w:val="26"/>
-          <w:szCs w:val="26"/>
-          <w:lang w:eastAsia="hu-HU"/>
-        </w:rPr>
-        <w:t xml:space="preserve">. A kínálatban olyan neves márkák szerepelnek, mint a </w:t>
-      </w:r>
-      <w:r>
-        <w:rPr>
-          <w:rFonts w:ascii="Times New Roman" w:eastAsia="Times New Roman" w:hAnsi="Times New Roman" w:cs="Times New Roman"/>
-          <w:bCs/>
-          <w:sz w:val="26"/>
-          <w:szCs w:val="26"/>
-          <w:u w:val="single"/>
-          <w:lang w:eastAsia="hu-HU"/>
-        </w:rPr>
-        <w:t xml:space="preserve">Chrome </w:t>
-      </w:r>
-      <w:proofErr w:type="spellStart"/>
-      <w:r>
-        <w:rPr>
-          <w:rFonts w:ascii="Times New Roman" w:eastAsia="Times New Roman" w:hAnsi="Times New Roman" w:cs="Times New Roman"/>
-          <w:bCs/>
-          <w:sz w:val="26"/>
-          <w:szCs w:val="26"/>
-          <w:u w:val="single"/>
-          <w:lang w:eastAsia="hu-HU"/>
-        </w:rPr>
-        <w:t>Hearts</w:t>
-      </w:r>
-      <w:proofErr w:type="spellEnd"/>
-      <w:r>
-        <w:rPr>
-          <w:rFonts w:ascii="Times New Roman" w:eastAsia="Times New Roman" w:hAnsi="Times New Roman" w:cs="Times New Roman"/>
-          <w:sz w:val="26"/>
-          <w:szCs w:val="26"/>
-          <w:lang w:eastAsia="hu-HU"/>
-        </w:rPr>
-        <w:t xml:space="preserve">, </w:t>
-      </w:r>
-      <w:proofErr w:type="spellStart"/>
-      <w:r>
-        <w:rPr>
-          <w:rFonts w:ascii="Times New Roman" w:eastAsia="Times New Roman" w:hAnsi="Times New Roman" w:cs="Times New Roman"/>
-          <w:bCs/>
-          <w:sz w:val="26"/>
-          <w:szCs w:val="26"/>
-          <w:u w:val="single"/>
-          <w:lang w:eastAsia="hu-HU"/>
-        </w:rPr>
-        <w:t>Stüssy</w:t>
-      </w:r>
-      <w:proofErr w:type="spellEnd"/>
-      <w:r>
-        <w:rPr>
-          <w:rFonts w:ascii="Times New Roman" w:eastAsia="Times New Roman" w:hAnsi="Times New Roman" w:cs="Times New Roman"/>
-          <w:sz w:val="26"/>
-          <w:szCs w:val="26"/>
-          <w:lang w:eastAsia="hu-HU"/>
-        </w:rPr>
-        <w:t xml:space="preserve">, </w:t>
-      </w:r>
-      <w:proofErr w:type="spellStart"/>
-      <w:r>
-        <w:rPr>
-          <w:rFonts w:ascii="Times New Roman" w:eastAsia="Times New Roman" w:hAnsi="Times New Roman" w:cs="Times New Roman"/>
-          <w:bCs/>
-          <w:sz w:val="26"/>
-          <w:szCs w:val="26"/>
-          <w:u w:val="single"/>
-          <w:lang w:eastAsia="hu-HU"/>
-        </w:rPr>
-        <w:t>Denim</w:t>
-      </w:r>
-      <w:proofErr w:type="spellEnd"/>
-      <w:r>
-        <w:rPr>
-          <w:rFonts w:ascii="Times New Roman" w:eastAsia="Times New Roman" w:hAnsi="Times New Roman" w:cs="Times New Roman"/>
-          <w:bCs/>
-          <w:sz w:val="26"/>
-          <w:szCs w:val="26"/>
-          <w:u w:val="single"/>
-          <w:lang w:eastAsia="hu-HU"/>
-        </w:rPr>
-        <w:t xml:space="preserve"> </w:t>
-      </w:r>
-      <w:proofErr w:type="spellStart"/>
-      <w:r>
-        <w:rPr>
-          <w:rFonts w:ascii="Times New Roman" w:eastAsia="Times New Roman" w:hAnsi="Times New Roman" w:cs="Times New Roman"/>
-          <w:bCs/>
-          <w:sz w:val="26"/>
-          <w:szCs w:val="26"/>
-          <w:u w:val="single"/>
-          <w:lang w:eastAsia="hu-HU"/>
-        </w:rPr>
-        <w:t>Tears</w:t>
-      </w:r>
-      <w:proofErr w:type="spellEnd"/>
-      <w:r>
-        <w:rPr>
-          <w:rFonts w:ascii="Times New Roman" w:eastAsia="Times New Roman" w:hAnsi="Times New Roman" w:cs="Times New Roman"/>
-          <w:sz w:val="26"/>
-          <w:szCs w:val="26"/>
-          <w:lang w:eastAsia="hu-HU"/>
-        </w:rPr>
-        <w:t xml:space="preserve">, valamint más, hasonlóan elismert </w:t>
-      </w:r>
-      <w:proofErr w:type="spellStart"/>
-      <w:r>
-        <w:rPr>
-          <w:rFonts w:ascii="Times New Roman" w:eastAsia="Times New Roman" w:hAnsi="Times New Roman" w:cs="Times New Roman"/>
-          <w:sz w:val="26"/>
-          <w:szCs w:val="26"/>
-          <w:lang w:eastAsia="hu-HU"/>
-        </w:rPr>
-        <w:t>designer</w:t>
-      </w:r>
-      <w:proofErr w:type="spellEnd"/>
-      <w:r>
-        <w:rPr>
-          <w:rFonts w:ascii="Times New Roman" w:eastAsia="Times New Roman" w:hAnsi="Times New Roman" w:cs="Times New Roman"/>
-          <w:sz w:val="26"/>
-          <w:szCs w:val="26"/>
-          <w:lang w:eastAsia="hu-HU"/>
-        </w:rPr>
-        <w:t xml:space="preserve"> </w:t>
-      </w:r>
-      <w:proofErr w:type="spellStart"/>
-      <w:r>
-        <w:rPr>
-          <w:rFonts w:ascii="Times New Roman" w:eastAsia="Times New Roman" w:hAnsi="Times New Roman" w:cs="Times New Roman"/>
-          <w:sz w:val="26"/>
-          <w:szCs w:val="26"/>
-          <w:lang w:eastAsia="hu-HU"/>
-        </w:rPr>
-        <w:t>brandek</w:t>
-      </w:r>
-      <w:proofErr w:type="spellEnd"/>
-      <w:r>
-        <w:rPr>
-          <w:rFonts w:ascii="Times New Roman" w:eastAsia="Times New Roman" w:hAnsi="Times New Roman" w:cs="Times New Roman"/>
-          <w:sz w:val="26"/>
-          <w:szCs w:val="26"/>
-          <w:lang w:eastAsia="hu-HU"/>
-        </w:rPr>
-        <w:t>, amelyek a modern utcai divatot képviselik.</w:t>
-      </w:r>
-    </w:p>
-    <w:p>
-      <w:pPr>
-        <w:spacing w:before="100" w:beforeAutospacing="1" w:after="100" w:afterAutospacing="1" w:line="276" w:lineRule="auto"/>
-        <w:jc w:val="center"/>
-        <w:rPr>
-          <w:rFonts w:ascii="Times New Roman" w:eastAsia="Times New Roman" w:hAnsi="Times New Roman" w:cs="Times New Roman"/>
-          <w:sz w:val="26"/>
-          <w:szCs w:val="26"/>
-          <w:lang w:eastAsia="hu-HU"/>
-        </w:rPr>
-      </w:pPr>
-      <w:r>
-        <w:rPr>
-          <w:rFonts w:ascii="Times New Roman" w:eastAsia="Times New Roman" w:hAnsi="Times New Roman" w:cs="Times New Roman"/>
-          <w:sz w:val="26"/>
-          <w:szCs w:val="26"/>
-          <w:lang w:eastAsia="hu-HU"/>
-        </w:rPr>
-        <w:t xml:space="preserve">A weboldal kialakítása során kiemelt figyelmet kapott </w:t>
-      </w:r>
-      <w:r>
-        <w:rPr>
-          <w:rFonts w:ascii="Times New Roman" w:eastAsia="Times New Roman" w:hAnsi="Times New Roman" w:cs="Times New Roman"/>
-          <w:sz w:val="26"/>
-          <w:szCs w:val="26"/>
-          <w:lang w:eastAsia="hu-HU"/>
-        </w:rPr>
-        <w:t xml:space="preserve">a </w:t>
-      </w:r>
-      <w:r>
-        <w:rPr>
-          <w:rFonts w:ascii="Times New Roman" w:eastAsia="Times New Roman" w:hAnsi="Times New Roman" w:cs="Times New Roman"/>
-          <w:bCs/>
-          <w:sz w:val="26"/>
-          <w:szCs w:val="26"/>
-          <w:lang w:eastAsia="hu-HU"/>
-        </w:rPr>
-        <w:t>felhasználói élmény</w:t>
-      </w:r>
-      <w:r>
-        <w:rPr>
-          <w:rFonts w:ascii="Times New Roman" w:eastAsia="Times New Roman" w:hAnsi="Times New Roman" w:cs="Times New Roman"/>
-          <w:sz w:val="26"/>
-          <w:szCs w:val="26"/>
-          <w:lang w:eastAsia="hu-HU"/>
-        </w:rPr>
-        <w:t xml:space="preserve">. A dizájn letisztult, átlátható, és minden elem a könnyű navigációt szolgálja. A termékek között </w:t>
-      </w:r>
-      <w:r>
-        <w:rPr>
-          <w:rFonts w:ascii="Times New Roman" w:eastAsia="Times New Roman" w:hAnsi="Times New Roman" w:cs="Times New Roman"/>
-          <w:sz w:val="26"/>
-          <w:szCs w:val="26"/>
-          <w:u w:val="single"/>
-          <w:lang w:eastAsia="hu-HU"/>
-        </w:rPr>
-        <w:t>egyszerűen lehet keresni, szűrni és rendezni, így a vásárlók gyorsan megtalálhatják az igényeiknek megfelelő ruhadarabokat.</w:t>
-      </w:r>
-      <w:r>
-        <w:rPr>
-          <w:rFonts w:ascii="Times New Roman" w:eastAsia="Times New Roman" w:hAnsi="Times New Roman" w:cs="Times New Roman"/>
-          <w:sz w:val="26"/>
-          <w:szCs w:val="26"/>
-          <w:lang w:eastAsia="hu-HU"/>
-        </w:rPr>
-        <w:t xml:space="preserve"> Az oldal reszponzív kialakítású, </w:t>
-      </w:r>
-      <w:r>
-        <w:rPr>
-          <w:rFonts w:ascii="Times New Roman" w:eastAsia="Times New Roman" w:hAnsi="Times New Roman" w:cs="Times New Roman"/>
-          <w:sz w:val="26"/>
-          <w:szCs w:val="26"/>
-          <w:lang w:eastAsia="hu-HU"/>
-        </w:rPr>
-        <w:t xml:space="preserve">vagyis </w:t>
-      </w:r>
-      <w:r>
-        <w:rPr>
-          <w:rFonts w:ascii="Times New Roman" w:eastAsia="Times New Roman" w:hAnsi="Times New Roman" w:cs="Times New Roman"/>
-          <w:sz w:val="26"/>
-          <w:szCs w:val="26"/>
-          <w:u w:val="single"/>
-          <w:lang w:eastAsia="hu-HU"/>
-        </w:rPr>
-        <w:t xml:space="preserve">asztali gépen, tableten és mobiltelefonon </w:t>
-      </w:r>
-      <w:r>
-        <w:rPr>
-          <w:rFonts w:ascii="Times New Roman" w:eastAsia="Times New Roman" w:hAnsi="Times New Roman" w:cs="Times New Roman"/>
-          <w:sz w:val="26"/>
-          <w:szCs w:val="26"/>
-          <w:lang w:eastAsia="hu-HU"/>
-        </w:rPr>
-        <w:t>is optimális megjelenítést és működést biztosít.</w:t>
-      </w:r>
-    </w:p>
-    <w:p>
-      <w:pPr>
-        <w:spacing w:before="100" w:beforeAutospacing="1" w:after="100" w:afterAutospacing="1" w:line="276" w:lineRule="auto"/>
-        <w:jc w:val="center"/>
-        <w:rPr>
-          <w:rFonts w:ascii="Times New Roman" w:eastAsia="Times New Roman" w:hAnsi="Times New Roman" w:cs="Times New Roman"/>
-          <w:sz w:val="26"/>
-          <w:szCs w:val="26"/>
-          <w:lang w:eastAsia="hu-HU"/>
-        </w:rPr>
-      </w:pPr>
-      <w:r>
-        <w:rPr>
-          <w:rFonts w:ascii="Times New Roman" w:eastAsia="Times New Roman" w:hAnsi="Times New Roman" w:cs="Times New Roman"/>
-          <w:sz w:val="26"/>
-          <w:szCs w:val="26"/>
-          <w:lang w:eastAsia="hu-HU"/>
-        </w:rPr>
-        <w:t xml:space="preserve">A </w:t>
-      </w:r>
-      <w:proofErr w:type="spellStart"/>
-      <w:r>
-        <w:rPr>
-          <w:rFonts w:ascii="Times New Roman" w:eastAsia="Times New Roman" w:hAnsi="Times New Roman" w:cs="Times New Roman"/>
-          <w:b/>
-          <w:bCs/>
-          <w:sz w:val="26"/>
-          <w:szCs w:val="26"/>
-          <w:lang w:eastAsia="hu-HU"/>
-        </w:rPr>
-        <w:t>PandaPlug</w:t>
-      </w:r>
-      <w:proofErr w:type="spellEnd"/>
-      <w:r>
-        <w:rPr>
-          <w:rFonts w:ascii="Times New Roman" w:eastAsia="Times New Roman" w:hAnsi="Times New Roman" w:cs="Times New Roman"/>
-          <w:sz w:val="26"/>
-          <w:szCs w:val="26"/>
-          <w:lang w:eastAsia="hu-HU"/>
-        </w:rPr>
-        <w:t xml:space="preserve"> nem csupán egy online bolt, hanem egy közösség is, amely a kortárs </w:t>
-      </w:r>
-      <w:proofErr w:type="spellStart"/>
-      <w:r>
-        <w:rPr>
-          <w:rFonts w:ascii="Times New Roman" w:eastAsia="Times New Roman" w:hAnsi="Times New Roman" w:cs="Times New Roman"/>
-          <w:sz w:val="26"/>
-          <w:szCs w:val="26"/>
-          <w:u w:val="single"/>
-          <w:lang w:eastAsia="hu-HU"/>
-        </w:rPr>
-        <w:t>streetwear</w:t>
-      </w:r>
-      <w:proofErr w:type="spellEnd"/>
-      <w:r>
-        <w:rPr>
-          <w:rFonts w:ascii="Times New Roman" w:eastAsia="Times New Roman" w:hAnsi="Times New Roman" w:cs="Times New Roman"/>
-          <w:sz w:val="26"/>
-          <w:szCs w:val="26"/>
-          <w:lang w:eastAsia="hu-HU"/>
-        </w:rPr>
-        <w:t xml:space="preserve"> kultúra iránt érdeklődő fiatalokat és </w:t>
-      </w:r>
-      <w:r>
-        <w:rPr>
-          <w:rFonts w:ascii="Times New Roman" w:eastAsia="Times New Roman" w:hAnsi="Times New Roman" w:cs="Times New Roman"/>
-          <w:sz w:val="26"/>
-          <w:szCs w:val="26"/>
-          <w:u w:val="single"/>
-          <w:lang w:eastAsia="hu-HU"/>
-        </w:rPr>
-        <w:t>divatkedvelőket szólítja meg</w:t>
-      </w:r>
-      <w:r>
-        <w:rPr>
-          <w:rFonts w:ascii="Times New Roman" w:eastAsia="Times New Roman" w:hAnsi="Times New Roman" w:cs="Times New Roman"/>
-          <w:sz w:val="26"/>
-          <w:szCs w:val="26"/>
-          <w:lang w:eastAsia="hu-HU"/>
-        </w:rPr>
-        <w:t xml:space="preserve">. A platform célja, hogy hidat képezzen a vásárlók és a </w:t>
-      </w:r>
-      <w:r>
-        <w:rPr>
-          <w:rFonts w:ascii="Times New Roman" w:eastAsia="Times New Roman" w:hAnsi="Times New Roman" w:cs="Times New Roman"/>
-          <w:sz w:val="26"/>
-          <w:szCs w:val="26"/>
-          <w:u w:val="single"/>
-          <w:lang w:eastAsia="hu-HU"/>
-        </w:rPr>
-        <w:t xml:space="preserve">prémium </w:t>
-      </w:r>
-      <w:proofErr w:type="spellStart"/>
-      <w:r>
-        <w:rPr>
-          <w:rFonts w:ascii="Times New Roman" w:eastAsia="Times New Roman" w:hAnsi="Times New Roman" w:cs="Times New Roman"/>
-          <w:sz w:val="26"/>
-          <w:szCs w:val="26"/>
-          <w:u w:val="single"/>
-          <w:lang w:eastAsia="hu-HU"/>
-        </w:rPr>
-        <w:t>designer</w:t>
-      </w:r>
-      <w:proofErr w:type="spellEnd"/>
-      <w:r>
-        <w:rPr>
-          <w:rFonts w:ascii="Times New Roman" w:eastAsia="Times New Roman" w:hAnsi="Times New Roman" w:cs="Times New Roman"/>
-          <w:sz w:val="26"/>
-          <w:szCs w:val="26"/>
-          <w:lang w:eastAsia="hu-HU"/>
-        </w:rPr>
-        <w:t xml:space="preserve"> márkák között, lehetőséget adva arra, hogy </w:t>
-      </w:r>
-      <w:r>
-        <w:rPr>
-          <w:rFonts w:ascii="Times New Roman" w:eastAsia="Times New Roman" w:hAnsi="Times New Roman" w:cs="Times New Roman"/>
-          <w:sz w:val="26"/>
-          <w:szCs w:val="26"/>
-          <w:u w:val="single"/>
-          <w:lang w:eastAsia="hu-HU"/>
-        </w:rPr>
-        <w:t>mindenki kifejezhesse saját stílusát</w:t>
-      </w:r>
-      <w:r>
-        <w:rPr>
-          <w:rFonts w:ascii="Times New Roman" w:eastAsia="Times New Roman" w:hAnsi="Times New Roman" w:cs="Times New Roman"/>
-          <w:sz w:val="26"/>
-          <w:szCs w:val="26"/>
-          <w:lang w:eastAsia="hu-HU"/>
-        </w:rPr>
-        <w:t xml:space="preserve"> eredeti és minőségi ruházati termékeken keresztül.</w:t>
-      </w:r>
-    </w:p>
-    <w:p>
-      <w:pPr>
-        <w:spacing w:before="100" w:beforeAutospacing="1" w:after="100" w:afterAutospacing="1" w:line="276" w:lineRule="auto"/>
-        <w:jc w:val="center"/>
-        <w:rPr>
-          <w:rFonts w:ascii="Times New Roman" w:eastAsia="Times New Roman" w:hAnsi="Times New Roman" w:cs="Times New Roman"/>
-          <w:sz w:val="26"/>
-          <w:szCs w:val="26"/>
-          <w:lang w:eastAsia="hu-HU"/>
-        </w:rPr>
-      </w:pPr>
-      <w:r>
-        <w:rPr>
-          <w:rFonts w:ascii="Times New Roman" w:eastAsia="Times New Roman" w:hAnsi="Times New Roman" w:cs="Times New Roman"/>
-          <w:sz w:val="26"/>
-          <w:szCs w:val="26"/>
-          <w:lang w:eastAsia="hu-HU"/>
-        </w:rPr>
-        <w:t xml:space="preserve">A fejlesztés során </w:t>
-      </w:r>
-      <w:r>
-        <w:rPr>
-          <w:rFonts w:ascii="Times New Roman" w:eastAsia="Times New Roman" w:hAnsi="Times New Roman" w:cs="Times New Roman"/>
-          <w:sz w:val="26"/>
-          <w:szCs w:val="26"/>
-          <w:u w:val="single"/>
-          <w:lang w:eastAsia="hu-HU"/>
-        </w:rPr>
-        <w:t xml:space="preserve">fontos szempont volt a </w:t>
-      </w:r>
-      <w:r>
-        <w:rPr>
-          <w:rFonts w:ascii="Times New Roman" w:eastAsia="Times New Roman" w:hAnsi="Times New Roman" w:cs="Times New Roman"/>
-          <w:bCs/>
-          <w:sz w:val="26"/>
-          <w:szCs w:val="26"/>
-          <w:u w:val="single"/>
-          <w:lang w:eastAsia="hu-HU"/>
-        </w:rPr>
-        <w:t>biztonságos vásárlás</w:t>
-      </w:r>
-      <w:r>
-        <w:rPr>
-          <w:rFonts w:ascii="Times New Roman" w:eastAsia="Times New Roman" w:hAnsi="Times New Roman" w:cs="Times New Roman"/>
-          <w:sz w:val="26"/>
-          <w:szCs w:val="26"/>
-          <w:u w:val="single"/>
-          <w:lang w:eastAsia="hu-HU"/>
-        </w:rPr>
-        <w:t xml:space="preserve"> és az </w:t>
-      </w:r>
-      <w:r>
-        <w:rPr>
-          <w:rFonts w:ascii="Times New Roman" w:eastAsia="Times New Roman" w:hAnsi="Times New Roman" w:cs="Times New Roman"/>
-          <w:bCs/>
-          <w:sz w:val="26"/>
-          <w:szCs w:val="26"/>
-          <w:u w:val="single"/>
-          <w:lang w:eastAsia="hu-HU"/>
-        </w:rPr>
-        <w:t>adatvédelem</w:t>
-      </w:r>
-      <w:r>
-        <w:rPr>
-          <w:rFonts w:ascii="Times New Roman" w:eastAsia="Times New Roman" w:hAnsi="Times New Roman" w:cs="Times New Roman"/>
-          <w:sz w:val="26"/>
-          <w:szCs w:val="26"/>
-          <w:lang w:eastAsia="hu-HU"/>
-        </w:rPr>
-        <w:t xml:space="preserve">. A </w:t>
-      </w:r>
-      <w:proofErr w:type="spellStart"/>
-      <w:r>
-        <w:rPr>
-          <w:rFonts w:ascii="Times New Roman" w:eastAsia="Times New Roman" w:hAnsi="Times New Roman" w:cs="Times New Roman"/>
-          <w:b/>
-          <w:sz w:val="26"/>
-          <w:szCs w:val="26"/>
-          <w:lang w:eastAsia="hu-HU"/>
-        </w:rPr>
-        <w:t>PandaPlug</w:t>
-      </w:r>
-      <w:proofErr w:type="spellEnd"/>
-      <w:r>
-        <w:rPr>
-          <w:rFonts w:ascii="Times New Roman" w:eastAsia="Times New Roman" w:hAnsi="Times New Roman" w:cs="Times New Roman"/>
-          <w:sz w:val="26"/>
-          <w:szCs w:val="26"/>
-          <w:lang w:eastAsia="hu-HU"/>
-        </w:rPr>
-        <w:t xml:space="preserve"> megbízható fizetési rendszereket és modern adatvédelmi megoldásokat alkalmaz annak érdekében, hogy </w:t>
-      </w:r>
-      <w:r>
-        <w:rPr>
-          <w:rFonts w:ascii="Times New Roman" w:eastAsia="Times New Roman" w:hAnsi="Times New Roman" w:cs="Times New Roman"/>
-          <w:sz w:val="26"/>
-          <w:szCs w:val="26"/>
-          <w:u w:val="single"/>
-          <w:lang w:eastAsia="hu-HU"/>
-        </w:rPr>
-        <w:t>a felhasználók adatai mindig védve legyenek</w:t>
-      </w:r>
-      <w:r>
-        <w:rPr>
-          <w:rFonts w:ascii="Times New Roman" w:eastAsia="Times New Roman" w:hAnsi="Times New Roman" w:cs="Times New Roman"/>
-          <w:sz w:val="26"/>
-          <w:szCs w:val="26"/>
-          <w:lang w:eastAsia="hu-HU"/>
-        </w:rPr>
-        <w:t>. Emellett a rendelési folyamat egyszerű és átlátható: a termékek kiválasztásától a fizetésig minden lépés egyértelműen követhető.</w:t>
-      </w:r>
-    </w:p>
-    <w:p>
-      <w:pPr>
-        <w:spacing w:before="100" w:beforeAutospacing="1" w:after="100" w:afterAutospacing="1" w:line="276" w:lineRule="auto"/>
-        <w:jc w:val="center"/>
-        <w:rPr>
-          <w:rFonts w:ascii="Times New Roman" w:eastAsia="Times New Roman" w:hAnsi="Times New Roman" w:cs="Times New Roman"/>
-          <w:sz w:val="26"/>
-          <w:szCs w:val="26"/>
-          <w:lang w:eastAsia="hu-HU"/>
-        </w:rPr>
-      </w:pPr>
-      <w:r>
-        <w:rPr>
-          <w:rFonts w:ascii="Times New Roman" w:eastAsia="Times New Roman" w:hAnsi="Times New Roman" w:cs="Times New Roman"/>
-          <w:sz w:val="26"/>
-          <w:szCs w:val="26"/>
-          <w:lang w:eastAsia="hu-HU"/>
-        </w:rPr>
-        <w:t xml:space="preserve">Összességében a </w:t>
-      </w:r>
-      <w:proofErr w:type="spellStart"/>
-      <w:r>
-        <w:rPr>
-          <w:rFonts w:ascii="Times New Roman" w:eastAsia="Times New Roman" w:hAnsi="Times New Roman" w:cs="Times New Roman"/>
-          <w:b/>
-          <w:bCs/>
-          <w:sz w:val="26"/>
-          <w:szCs w:val="26"/>
-          <w:lang w:eastAsia="hu-HU"/>
-        </w:rPr>
-        <w:t>PandaPlug</w:t>
-      </w:r>
-      <w:proofErr w:type="spellEnd"/>
-      <w:r>
-        <w:rPr>
-          <w:rFonts w:ascii="Times New Roman" w:eastAsia="Times New Roman" w:hAnsi="Times New Roman" w:cs="Times New Roman"/>
-          <w:sz w:val="26"/>
-          <w:szCs w:val="26"/>
-          <w:lang w:eastAsia="hu-HU"/>
-        </w:rPr>
-        <w:t xml:space="preserve"> célja, hogy magas színvonalú, megbízható és </w:t>
-      </w:r>
-      <w:proofErr w:type="spellStart"/>
-      <w:r>
-        <w:rPr>
-          <w:rFonts w:ascii="Times New Roman" w:eastAsia="Times New Roman" w:hAnsi="Times New Roman" w:cs="Times New Roman"/>
-          <w:sz w:val="26"/>
-          <w:szCs w:val="26"/>
-          <w:lang w:eastAsia="hu-HU"/>
-        </w:rPr>
-        <w:t>esztétikailag</w:t>
-      </w:r>
-      <w:proofErr w:type="spellEnd"/>
-      <w:r>
-        <w:rPr>
-          <w:rFonts w:ascii="Times New Roman" w:eastAsia="Times New Roman" w:hAnsi="Times New Roman" w:cs="Times New Roman"/>
-          <w:sz w:val="26"/>
-          <w:szCs w:val="26"/>
-          <w:lang w:eastAsia="hu-HU"/>
-        </w:rPr>
-        <w:t xml:space="preserve"> igényes online áruházként szolgálja ki a </w:t>
-      </w:r>
-      <w:proofErr w:type="spellStart"/>
-      <w:r>
-        <w:rPr>
-          <w:rFonts w:ascii="Times New Roman" w:eastAsia="Times New Roman" w:hAnsi="Times New Roman" w:cs="Times New Roman"/>
-          <w:sz w:val="26"/>
-          <w:szCs w:val="26"/>
-          <w:lang w:eastAsia="hu-HU"/>
-        </w:rPr>
-        <w:t>designer</w:t>
-      </w:r>
-      <w:proofErr w:type="spellEnd"/>
-      <w:r>
-        <w:rPr>
-          <w:rFonts w:ascii="Times New Roman" w:eastAsia="Times New Roman" w:hAnsi="Times New Roman" w:cs="Times New Roman"/>
-          <w:sz w:val="26"/>
-          <w:szCs w:val="26"/>
-          <w:lang w:eastAsia="hu-HU"/>
-        </w:rPr>
-        <w:t xml:space="preserve"> divat iránt érdeklődő vásárlókat. </w:t>
-      </w:r>
-      <w:r>
-        <w:rPr>
-          <w:rFonts w:ascii="Times New Roman" w:eastAsia="Times New Roman" w:hAnsi="Times New Roman" w:cs="Times New Roman"/>
-          <w:sz w:val="26"/>
-          <w:szCs w:val="26"/>
-          <w:u w:val="single"/>
-          <w:lang w:eastAsia="hu-HU"/>
-        </w:rPr>
-        <w:t xml:space="preserve">A weboldal egyszerre testesíti meg a modern technológia és a </w:t>
-      </w:r>
-      <w:proofErr w:type="spellStart"/>
-      <w:r>
-        <w:rPr>
-          <w:rFonts w:ascii="Times New Roman" w:eastAsia="Times New Roman" w:hAnsi="Times New Roman" w:cs="Times New Roman"/>
-          <w:sz w:val="26"/>
-          <w:szCs w:val="26"/>
-          <w:u w:val="single"/>
-          <w:lang w:eastAsia="hu-HU"/>
-        </w:rPr>
-        <w:t>streetwear</w:t>
-      </w:r>
-      <w:proofErr w:type="spellEnd"/>
-      <w:r>
-        <w:rPr>
-          <w:rFonts w:ascii="Times New Roman" w:eastAsia="Times New Roman" w:hAnsi="Times New Roman" w:cs="Times New Roman"/>
-          <w:sz w:val="26"/>
-          <w:szCs w:val="26"/>
-          <w:u w:val="single"/>
-          <w:lang w:eastAsia="hu-HU"/>
-        </w:rPr>
-        <w:t xml:space="preserve"> kultúra találkozását</w:t>
-      </w:r>
-      <w:r>
-        <w:rPr>
-          <w:rFonts w:ascii="Times New Roman" w:eastAsia="Times New Roman" w:hAnsi="Times New Roman" w:cs="Times New Roman"/>
-          <w:sz w:val="26"/>
-          <w:szCs w:val="26"/>
-          <w:lang w:eastAsia="hu-HU"/>
-        </w:rPr>
-        <w:t xml:space="preserve">, miközben a </w:t>
-      </w:r>
-      <w:r>
-        <w:rPr>
-          <w:rFonts w:ascii="Times New Roman" w:eastAsia="Times New Roman" w:hAnsi="Times New Roman" w:cs="Times New Roman"/>
-          <w:sz w:val="26"/>
-          <w:szCs w:val="26"/>
-          <w:u w:val="single"/>
-          <w:lang w:eastAsia="hu-HU"/>
-        </w:rPr>
-        <w:t>felhasználók számára könnyen kezelhető, gyors és inspiráló vásárlási élményt nyújt</w:t>
-      </w:r>
-      <w:r>
-        <w:rPr>
-          <w:rFonts w:ascii="Times New Roman" w:eastAsia="Times New Roman" w:hAnsi="Times New Roman" w:cs="Times New Roman"/>
-          <w:sz w:val="26"/>
-          <w:szCs w:val="26"/>
-          <w:lang w:eastAsia="hu-HU"/>
-        </w:rPr>
-        <w:t>.</w:t>
-      </w:r>
-    </w:p>
-    <w:p>
-      <w:pPr>
-        <w:rPr>
-          <w:rFonts w:ascii="Times New Roman" w:eastAsia="Times New Roman" w:hAnsi="Times New Roman" w:cs="Times New Roman"/>
-          <w:sz w:val="26"/>
-          <w:szCs w:val="26"/>
-          <w:lang w:eastAsia="hu-HU"/>
-        </w:rPr>
-      </w:pPr>
-      <w:r>
-        <w:rPr>
-          <w:b/>
-          <w:bCs/>
-          <w:sz w:val="26"/>
-          <w:szCs w:val="26"/>
         </w:rPr>
         <w:br w:type="page"/>
       </w:r>
@@ -922,6 +410,7 @@
         <w:pStyle w:val="Cmsor2"/>
       </w:pPr>
       <w:r>
+        <w:lastRenderedPageBreak/>
         <w:t>2. Az adatbázis felépítése</w:t>
       </w:r>
     </w:p>
@@ -1093,12 +582,7 @@
       <w:proofErr w:type="spellEnd"/>
       <w:r>
         <w:br/>
-        <w:t>A termékek</w:t>
-      </w:r>
-      <w:bookmarkStart w:id="0" w:name="_GoBack"/>
-      <w:bookmarkEnd w:id="0"/>
-      <w:r>
-        <w:t xml:space="preserve"> kategóriáit tárolja (például póló, pulóver, nadrág, rövidnadrág).</w:t>
+        <w:t>A termékek kategóriáit tárolja (például póló, pulóver, nadrág, rövidnadrág).</w:t>
       </w:r>
     </w:p>
     <w:p>
@@ -2998,6 +2482,7 @@
           <w:sz w:val="32"/>
           <w:szCs w:val="32"/>
         </w:rPr>
+        <w:lastRenderedPageBreak/>
         <w:t>Kosárral kapcsolatos végpontok</w:t>
       </w:r>
     </w:p>
@@ -3574,6 +3059,7 @@
         <w:pStyle w:val="Cmsor2"/>
       </w:pPr>
       <w:r>
+        <w:lastRenderedPageBreak/>
         <w:t>A rendszer működésének műszaki feltételei</w:t>
       </w:r>
     </w:p>
@@ -3624,7 +3110,7 @@
     <w:p>
       <w:r>
         <w:pict>
-          <v:rect id="_x0000_i1026" style="width:0;height:1.5pt" o:hralign="center" o:hrstd="t" o:hr="t" fillcolor="#a0a0a0" stroked="f"/>
+          <v:rect id="_x0000_i1025" style="width:0;height:1.5pt" o:hralign="center" o:hrstd="t" o:hr="t" fillcolor="#a0a0a0" stroked="f"/>
         </w:pict>
       </w:r>
     </w:p>
@@ -3704,7 +3190,7 @@
     <w:p>
       <w:r>
         <w:pict>
-          <v:rect id="_x0000_i1027" style="width:0;height:1.5pt" o:hralign="center" o:hrstd="t" o:hr="t" fillcolor="#a0a0a0" stroked="f"/>
+          <v:rect id="_x0000_i1026" style="width:0;height:1.5pt" o:hralign="center" o:hrstd="t" o:hr="t" fillcolor="#a0a0a0" stroked="f"/>
         </w:pict>
       </w:r>
     </w:p>
@@ -3779,6 +3265,7 @@
         <w:pStyle w:val="Cmsor2"/>
       </w:pPr>
       <w:r>
+        <w:lastRenderedPageBreak/>
         <w:t>Komponensek technikai leírása</w:t>
       </w:r>
     </w:p>
@@ -3880,7 +3367,6 @@
         <w:pStyle w:val="NormlWeb"/>
       </w:pPr>
       <w:r>
-        <w:lastRenderedPageBreak/>
         <w:t xml:space="preserve">Az állapotkezelés a </w:t>
       </w:r>
       <w:proofErr w:type="spellStart"/>

</xml_diff>